<commit_message>
fix: centralizacao do titulo/cabecalho e remocao de espacos duplos
</commit_message>
<xml_diff>
--- a/modelo_base.docx
+++ b/modelo_base.docx
@@ -5434,7 +5434,7 @@
             <wp:anchor distT="0" distB="0" distL="114300" distR="114300" simplePos="0" relativeHeight="251657728" behindDoc="0" locked="0" layoutInCell="0" allowOverlap="1" wp14:anchorId="6F72FDD8" wp14:editId="29813D7C">
               <wp:simplePos x="0" y="0"/>
               <wp:positionH relativeFrom="column">
-                <wp:posOffset>800100</wp:posOffset>
+                <wp:posOffset>1310005</wp:posOffset>
               </wp:positionH>
               <wp:positionV relativeFrom="paragraph">
                 <wp:posOffset>6985</wp:posOffset>
@@ -5562,7 +5562,7 @@
         </mc:Choice>
         <mc:Fallback>
           <w:pict>
-            <v:shape w14:anchorId="6F72FDD8" id=" 2" o:spid="_x0000_s1027" type="#_x0000_t202" style="position:absolute;margin-left:63pt;margin-top:.55pt;width:389.05pt;height:63.55pt;z-index:251657728;visibility:visible;mso-wrap-style:square;mso-width-percent:0;mso-height-percent:0;mso-wrap-distance-left:9pt;mso-wrap-distance-top:0;mso-wrap-distance-right:9pt;mso-wrap-distance-bottom:0;mso-position-horizontal:absolute;mso-position-horizontal-relative:text;mso-position-vertical:absolute;mso-position-vertical-relative:text;mso-width-percent:0;mso-height-percent:0;mso-width-relative:page;mso-height-relative:page;v-text-anchor:top" o:gfxdata="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" o:allowincell="f" filled="f" stroked="f">
+            <v:shape w14:anchorId="6F72FDD8" id=" 2" o:spid="_x0000_s1027" type="#_x0000_t202" style="position:absolute;margin-left:103.15pt;margin-top:.55pt;width:389.05pt;height:63.55pt;z-index:251657728;visibility:visible;mso-wrap-style:square;mso-width-percent:0;mso-height-percent:0;mso-wrap-distance-left:9pt;mso-wrap-distance-top:0;mso-wrap-distance-right:9pt;mso-wrap-distance-bottom:0;mso-position-horizontal:absolute;mso-position-horizontal-relative:text;mso-position-vertical:absolute;mso-position-vertical-relative:text;mso-width-percent:0;mso-height-percent:0;mso-width-relative:page;mso-height-relative:page;v-text-anchor:top" o:gfxdata="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" o:allowincell="f" filled="f" stroked="f">
               <v:path arrowok="t"/>
               <v:textbox>
                 <w:txbxContent>

</xml_diff>

<commit_message>
fix: centralizacao da linha divisoria do cabecalho
</commit_message>
<xml_diff>
--- a/modelo_base.docx
+++ b/modelo_base.docx
@@ -5681,7 +5681,7 @@
             <wp:anchor distT="0" distB="0" distL="114300" distR="114300" simplePos="0" relativeHeight="251658752" behindDoc="0" locked="0" layoutInCell="0" allowOverlap="1" wp14:anchorId="5E2074D1" wp14:editId="1E2E6DAA">
               <wp:simplePos x="0" y="0"/>
               <wp:positionH relativeFrom="column">
-                <wp:posOffset>-76200</wp:posOffset>
+                <wp:posOffset>751522</wp:posOffset>
               </wp:positionH>
               <wp:positionV relativeFrom="paragraph">
                 <wp:posOffset>65405</wp:posOffset>
@@ -5739,7 +5739,7 @@
         </mc:Choice>
         <mc:Fallback>
           <w:pict>
-            <v:line w14:anchorId="13AFF083" id=" 3" o:spid="_x0000_s1026" style="position:absolute;z-index:251658752;visibility:visible;mso-wrap-style:square;mso-width-percent:0;mso-height-percent:0;mso-wrap-distance-left:9pt;mso-wrap-distance-top:0;mso-wrap-distance-right:9pt;mso-wrap-distance-bottom:0;mso-position-horizontal:absolute;mso-position-horizontal-relative:text;mso-position-vertical:absolute;mso-position-vertical-relative:text;mso-width-percent:0;mso-height-percent:0;mso-width-relative:page;mso-height-relative:page" from="-6pt,5.15pt" to="471pt,5.15pt" o:gfxdata="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" o:allowincell="f">
+            <v:line w14:anchorId="13AFF083" id=" 3" o:spid="_x0000_s1026" style="position:absolute;z-index:251658752;visibility:visible;mso-wrap-style:square;mso-width-percent:0;mso-height-percent:0;mso-wrap-distance-left:9pt;mso-wrap-distance-top:0;mso-wrap-distance-right:9pt;mso-wrap-distance-bottom:0;mso-position-horizontal:absolute;mso-position-horizontal-relative:text;mso-position-vertical:absolute;mso-position-vertical-relative:text;mso-width-percent:0;mso-height-percent:0;mso-width-relative:page;mso-height-relative:page" from="59.175pt,5.15pt" to="536.175pt,5.15pt" o:gfxdata="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" o:allowincell="f">
               <o:lock v:ext="edit" shapetype="f"/>
             </v:line>
           </w:pict>

</xml_diff>

<commit_message>
fix: remocao de linha vazia acima do titulo
</commit_message>
<xml_diff>
--- a/modelo_base.docx
+++ b/modelo_base.docx
@@ -2,15 +2,6 @@
 <file path=word/document.xml><?xml version="1.0" encoding="utf-8"?>
 <w:document xmlns:wpc="http://schemas.microsoft.com/office/word/2010/wordprocessingCanvas" xmlns:cx="http://schemas.microsoft.com/office/drawing/2014/chartex" xmlns:cx1="http://schemas.microsoft.com/office/drawing/2015/9/8/chartex" xmlns:cx2="http://schemas.microsoft.com/office/drawing/2015/10/21/chartex" xmlns:cx3="http://schemas.microsoft.com/office/drawing/2016/5/9/chartex" xmlns:cx4="http://schemas.microsoft.com/office/drawing/2016/5/10/chartex" xmlns:cx5="http://schemas.microsoft.com/office/drawing/2016/5/11/chartex" xmlns:cx6="http://schemas.microsoft.com/office/drawing/2016/5/12/chartex" xmlns:cx7="http://schemas.microsoft.com/office/drawing/2016/5/13/chartex" xmlns:cx8="http://schemas.microsoft.com/office/drawing/2016/5/14/chartex" xmlns:mc="http://schemas.openxmlformats.org/markup-compatibility/2006" xmlns:aink="http://schemas.microsoft.com/office/drawing/2016/ink" xmlns:am3d="http://schemas.microsoft.com/office/drawing/2017/model3d" xmlns:o="urn:schemas-microsoft-com:office:office" xmlns:oel="http://schemas.microsoft.com/office/2019/extlst" xmlns:r="http://schemas.openxmlformats.org/officeDocument/2006/relationships" xmlns:m="http://schemas.openxmlformats.org/officeDocument/2006/math" xmlns:v="urn:schemas-microsoft-com:vml" xmlns:wp14="http://schemas.microsoft.com/office/word/2010/wordprocessingDrawing" xmlns:wp="http://schemas.openxmlformats.org/drawingml/2006/wordprocessingDrawing" xmlns:w10="urn:schemas-microsoft-com:office:word" xmlns:w="http://schemas.openxmlformats.org/wordprocessingml/2006/main" xmlns:w14="http://schemas.microsoft.com/office/word/2010/wordml" xmlns:w15="http://schemas.microsoft.com/office/word/2012/wordml" xmlns:w16cex="http://schemas.microsoft.com/office/word/2018/wordml/cex" xmlns:w16cid="http://schemas.microsoft.com/office/word/2016/wordml/cid" xmlns:w16="http://schemas.microsoft.com/office/word/2018/wordml" xmlns:w16du="http://schemas.microsoft.com/office/word/2023/wordml/word16du" xmlns:w16sdtdh="http://schemas.microsoft.com/office/word/2020/wordml/sdtdatahash" xmlns:w16sdtfl="http://schemas.microsoft.com/office/word/2024/wordml/sdtformatlock" xmlns:w16se="http://schemas.microsoft.com/office/word/2015/wordml/symex" xmlns:wpg="http://schemas.microsoft.com/office/word/2010/wordprocessingGroup" xmlns:wpi="http://schemas.microsoft.com/office/word/2010/wordprocessingInk" xmlns:wne="http://schemas.microsoft.com/office/word/2006/wordml" xmlns:wps="http://schemas.microsoft.com/office/word/2010/wordprocessingShape" mc:Ignorable="w14 w15 w16se w16cid w16 w16cex w16sdtdh w16sdtfl w16du wp14">
   <w:body>
-    <w:p>
-      <w:pPr>
-        <w:rPr>
-          <w:b/>
-          <w:sz w:val="32"/>
-          <w:szCs w:val="32"/>
-        </w:rPr>
-      </w:pPr>
-    </w:p>
     <w:p>
       <w:pPr>
         <w:jc w:val="center"/>

</xml_diff>

<commit_message>
style: aumento minimo na largura da coluna N
</commit_message>
<xml_diff>
--- a/modelo_base.docx
+++ b/modelo_base.docx
@@ -127,9 +127,9 @@
         <w:tblLook w:val="04A0" w:firstRow="1" w:lastRow="0" w:firstColumn="1" w:lastColumn="0" w:noHBand="0" w:noVBand="1"/>
       </w:tblPr>
       <w:tblGrid>
-        <w:gridCol w:w="362"/>
+        <w:gridCol w:w="480"/>
         <w:gridCol w:w="721"/>
-        <w:gridCol w:w="2376"/>
+        <w:gridCol w:w="2258"/>
         <w:gridCol w:w="1555"/>
         <w:gridCol w:w="1534"/>
         <w:gridCol w:w="1806"/>
@@ -142,7 +142,7 @@
         </w:trPr>
         <w:tc>
           <w:tcPr>
-            <w:tcW w:w="362" w:type="dxa"/>
+            <w:tcW w:w="480" w:type="dxa"/>
             <w:vAlign w:val="center"/>
           </w:tcPr>
           <w:p>
@@ -205,7 +205,7 @@
         </w:tc>
         <w:tc>
           <w:tcPr>
-            <w:tcW w:w="2376" w:type="dxa"/>
+            <w:tcW w:w="2258" w:type="dxa"/>
             <w:vAlign w:val="center"/>
           </w:tcPr>
           <w:p>
@@ -401,7 +401,7 @@
         </w:trPr>
         <w:tc>
           <w:tcPr>
-            <w:tcW w:w="362" w:type="dxa"/>
+            <w:tcW w:w="480" w:type="dxa"/>
             <w:vAlign w:val="center"/>
           </w:tcPr>
           <w:p>
@@ -491,7 +491,7 @@
         </w:tc>
         <w:tc>
           <w:tcPr>
-            <w:tcW w:w="2376" w:type="dxa"/>
+            <w:tcW w:w="2258" w:type="dxa"/>
           </w:tcPr>
           <w:p>
             <w:pPr>
@@ -667,7 +667,7 @@
         </w:trPr>
         <w:tc>
           <w:tcPr>
-            <w:tcW w:w="362" w:type="dxa"/>
+            <w:tcW w:w="480" w:type="dxa"/>
             <w:vAlign w:val="center"/>
           </w:tcPr>
           <w:p>
@@ -720,7 +720,7 @@
         </w:tc>
         <w:tc>
           <w:tcPr>
-            <w:tcW w:w="2376" w:type="dxa"/>
+            <w:tcW w:w="2258" w:type="dxa"/>
           </w:tcPr>
           <w:p>
             <w:pPr>
@@ -867,7 +867,7 @@
         </w:trPr>
         <w:tc>
           <w:tcPr>
-            <w:tcW w:w="362" w:type="dxa"/>
+            <w:tcW w:w="480" w:type="dxa"/>
             <w:vAlign w:val="center"/>
           </w:tcPr>
           <w:p>
@@ -920,7 +920,7 @@
         </w:tc>
         <w:tc>
           <w:tcPr>
-            <w:tcW w:w="2376" w:type="dxa"/>
+            <w:tcW w:w="2258" w:type="dxa"/>
           </w:tcPr>
           <w:p>
             <w:pPr>
@@ -1060,7 +1060,7 @@
         </w:trPr>
         <w:tc>
           <w:tcPr>
-            <w:tcW w:w="362" w:type="dxa"/>
+            <w:tcW w:w="480" w:type="dxa"/>
             <w:vAlign w:val="center"/>
           </w:tcPr>
           <w:p>
@@ -1103,7 +1103,7 @@
         </w:tc>
         <w:tc>
           <w:tcPr>
-            <w:tcW w:w="2376" w:type="dxa"/>
+            <w:tcW w:w="2258" w:type="dxa"/>
           </w:tcPr>
           <w:p>
             <w:pPr>
@@ -1213,7 +1213,7 @@
         </w:trPr>
         <w:tc>
           <w:tcPr>
-            <w:tcW w:w="362" w:type="dxa"/>
+            <w:tcW w:w="480" w:type="dxa"/>
             <w:vAlign w:val="center"/>
           </w:tcPr>
           <w:p>
@@ -1266,7 +1266,7 @@
         </w:tc>
         <w:tc>
           <w:tcPr>
-            <w:tcW w:w="2376" w:type="dxa"/>
+            <w:tcW w:w="2258" w:type="dxa"/>
           </w:tcPr>
           <w:p>
             <w:pPr>
@@ -1413,7 +1413,7 @@
         </w:trPr>
         <w:tc>
           <w:tcPr>
-            <w:tcW w:w="362" w:type="dxa"/>
+            <w:tcW w:w="480" w:type="dxa"/>
             <w:vAlign w:val="center"/>
           </w:tcPr>
           <w:p>
@@ -1457,7 +1457,7 @@
         </w:tc>
         <w:tc>
           <w:tcPr>
-            <w:tcW w:w="2376" w:type="dxa"/>
+            <w:tcW w:w="2258" w:type="dxa"/>
           </w:tcPr>
           <w:p>
             <w:pPr>
@@ -1567,7 +1567,7 @@
         </w:trPr>
         <w:tc>
           <w:tcPr>
-            <w:tcW w:w="362" w:type="dxa"/>
+            <w:tcW w:w="480" w:type="dxa"/>
             <w:vAlign w:val="center"/>
           </w:tcPr>
           <w:p>
@@ -1620,7 +1620,7 @@
         </w:tc>
         <w:tc>
           <w:tcPr>
-            <w:tcW w:w="2376" w:type="dxa"/>
+            <w:tcW w:w="2258" w:type="dxa"/>
           </w:tcPr>
           <w:p>
             <w:pPr>
@@ -1767,7 +1767,7 @@
         </w:trPr>
         <w:tc>
           <w:tcPr>
-            <w:tcW w:w="362" w:type="dxa"/>
+            <w:tcW w:w="480" w:type="dxa"/>
             <w:vAlign w:val="center"/>
           </w:tcPr>
           <w:p>
@@ -1811,7 +1811,7 @@
         </w:tc>
         <w:tc>
           <w:tcPr>
-            <w:tcW w:w="2376" w:type="dxa"/>
+            <w:tcW w:w="2258" w:type="dxa"/>
           </w:tcPr>
           <w:p>
             <w:pPr>
@@ -1951,7 +1951,7 @@
         </w:trPr>
         <w:tc>
           <w:tcPr>
-            <w:tcW w:w="362" w:type="dxa"/>
+            <w:tcW w:w="480" w:type="dxa"/>
             <w:vAlign w:val="center"/>
           </w:tcPr>
           <w:p>
@@ -2004,7 +2004,7 @@
         </w:tc>
         <w:tc>
           <w:tcPr>
-            <w:tcW w:w="2376" w:type="dxa"/>
+            <w:tcW w:w="2258" w:type="dxa"/>
           </w:tcPr>
           <w:p>
             <w:pPr>
@@ -2151,7 +2151,7 @@
         </w:trPr>
         <w:tc>
           <w:tcPr>
-            <w:tcW w:w="362" w:type="dxa"/>
+            <w:tcW w:w="480" w:type="dxa"/>
             <w:vAlign w:val="center"/>
           </w:tcPr>
           <w:p>
@@ -2195,7 +2195,7 @@
         </w:tc>
         <w:tc>
           <w:tcPr>
-            <w:tcW w:w="2376" w:type="dxa"/>
+            <w:tcW w:w="2258" w:type="dxa"/>
           </w:tcPr>
           <w:p>
             <w:pPr>
@@ -2299,7 +2299,7 @@
         </w:trPr>
         <w:tc>
           <w:tcPr>
-            <w:tcW w:w="362" w:type="dxa"/>
+            <w:tcW w:w="480" w:type="dxa"/>
             <w:vAlign w:val="center"/>
           </w:tcPr>
           <w:p>
@@ -2352,7 +2352,7 @@
         </w:tc>
         <w:tc>
           <w:tcPr>
-            <w:tcW w:w="2376" w:type="dxa"/>
+            <w:tcW w:w="2258" w:type="dxa"/>
           </w:tcPr>
           <w:p>
             <w:pPr>
@@ -2499,7 +2499,7 @@
         </w:trPr>
         <w:tc>
           <w:tcPr>
-            <w:tcW w:w="362" w:type="dxa"/>
+            <w:tcW w:w="480" w:type="dxa"/>
             <w:vAlign w:val="center"/>
           </w:tcPr>
           <w:p>
@@ -2543,7 +2543,7 @@
         </w:tc>
         <w:tc>
           <w:tcPr>
-            <w:tcW w:w="2376" w:type="dxa"/>
+            <w:tcW w:w="2258" w:type="dxa"/>
           </w:tcPr>
           <w:p>
             <w:pPr>
@@ -2650,7 +2650,7 @@
         </w:trPr>
         <w:tc>
           <w:tcPr>
-            <w:tcW w:w="362" w:type="dxa"/>
+            <w:tcW w:w="480" w:type="dxa"/>
             <w:vAlign w:val="center"/>
           </w:tcPr>
           <w:p>
@@ -2703,7 +2703,7 @@
         </w:tc>
         <w:tc>
           <w:tcPr>
-            <w:tcW w:w="2376" w:type="dxa"/>
+            <w:tcW w:w="2258" w:type="dxa"/>
           </w:tcPr>
           <w:p>
             <w:pPr>
@@ -2843,7 +2843,7 @@
         </w:trPr>
         <w:tc>
           <w:tcPr>
-            <w:tcW w:w="362" w:type="dxa"/>
+            <w:tcW w:w="480" w:type="dxa"/>
             <w:vAlign w:val="center"/>
           </w:tcPr>
           <w:p>
@@ -2886,7 +2886,7 @@
         </w:tc>
         <w:tc>
           <w:tcPr>
-            <w:tcW w:w="2376" w:type="dxa"/>
+            <w:tcW w:w="2258" w:type="dxa"/>
           </w:tcPr>
           <w:p>
             <w:pPr>
@@ -2993,7 +2993,7 @@
         </w:trPr>
         <w:tc>
           <w:tcPr>
-            <w:tcW w:w="362" w:type="dxa"/>
+            <w:tcW w:w="480" w:type="dxa"/>
             <w:vAlign w:val="center"/>
           </w:tcPr>
           <w:p>
@@ -3045,7 +3045,7 @@
         </w:tc>
         <w:tc>
           <w:tcPr>
-            <w:tcW w:w="2376" w:type="dxa"/>
+            <w:tcW w:w="2258" w:type="dxa"/>
           </w:tcPr>
           <w:p>
             <w:pPr>
@@ -3185,7 +3185,7 @@
         </w:trPr>
         <w:tc>
           <w:tcPr>
-            <w:tcW w:w="362" w:type="dxa"/>
+            <w:tcW w:w="480" w:type="dxa"/>
             <w:vAlign w:val="center"/>
           </w:tcPr>
           <w:p>
@@ -3229,7 +3229,7 @@
         </w:tc>
         <w:tc>
           <w:tcPr>
-            <w:tcW w:w="2376" w:type="dxa"/>
+            <w:tcW w:w="2258" w:type="dxa"/>
           </w:tcPr>
           <w:p>
             <w:pPr>
@@ -3339,7 +3339,7 @@
         </w:trPr>
         <w:tc>
           <w:tcPr>
-            <w:tcW w:w="362" w:type="dxa"/>
+            <w:tcW w:w="480" w:type="dxa"/>
             <w:vAlign w:val="center"/>
           </w:tcPr>
           <w:p>
@@ -3391,7 +3391,7 @@
         </w:tc>
         <w:tc>
           <w:tcPr>
-            <w:tcW w:w="2376" w:type="dxa"/>
+            <w:tcW w:w="2258" w:type="dxa"/>
           </w:tcPr>
           <w:p>
             <w:pPr>
@@ -3538,7 +3538,7 @@
         </w:trPr>
         <w:tc>
           <w:tcPr>
-            <w:tcW w:w="362" w:type="dxa"/>
+            <w:tcW w:w="480" w:type="dxa"/>
             <w:vAlign w:val="center"/>
           </w:tcPr>
           <w:p>
@@ -3581,7 +3581,7 @@
         </w:tc>
         <w:tc>
           <w:tcPr>
-            <w:tcW w:w="2376" w:type="dxa"/>
+            <w:tcW w:w="2258" w:type="dxa"/>
           </w:tcPr>
           <w:p>
             <w:pPr>
@@ -3719,7 +3719,7 @@
         </w:trPr>
         <w:tc>
           <w:tcPr>
-            <w:tcW w:w="362" w:type="dxa"/>
+            <w:tcW w:w="480" w:type="dxa"/>
             <w:vAlign w:val="center"/>
           </w:tcPr>
           <w:p>
@@ -3762,7 +3762,7 @@
         </w:tc>
         <w:tc>
           <w:tcPr>
-            <w:tcW w:w="2376" w:type="dxa"/>
+            <w:tcW w:w="2258" w:type="dxa"/>
           </w:tcPr>
           <w:p>
             <w:pPr>
@@ -3873,7 +3873,7 @@
         </w:trPr>
         <w:tc>
           <w:tcPr>
-            <w:tcW w:w="362" w:type="dxa"/>
+            <w:tcW w:w="480" w:type="dxa"/>
             <w:vAlign w:val="center"/>
           </w:tcPr>
           <w:p>
@@ -3916,7 +3916,7 @@
         </w:tc>
         <w:tc>
           <w:tcPr>
-            <w:tcW w:w="2376" w:type="dxa"/>
+            <w:tcW w:w="2258" w:type="dxa"/>
           </w:tcPr>
           <w:p>
             <w:pPr>
@@ -4033,7 +4033,7 @@
         </w:trPr>
         <w:tc>
           <w:tcPr>
-            <w:tcW w:w="362" w:type="dxa"/>
+            <w:tcW w:w="480" w:type="dxa"/>
             <w:vAlign w:val="center"/>
           </w:tcPr>
           <w:p>
@@ -4085,7 +4085,7 @@
         </w:tc>
         <w:tc>
           <w:tcPr>
-            <w:tcW w:w="2376" w:type="dxa"/>
+            <w:tcW w:w="2258" w:type="dxa"/>
           </w:tcPr>
           <w:p>
             <w:pPr>
@@ -4232,7 +4232,7 @@
         </w:trPr>
         <w:tc>
           <w:tcPr>
-            <w:tcW w:w="362" w:type="dxa"/>
+            <w:tcW w:w="480" w:type="dxa"/>
             <w:vAlign w:val="center"/>
           </w:tcPr>
           <w:p>
@@ -4284,7 +4284,7 @@
         </w:tc>
         <w:tc>
           <w:tcPr>
-            <w:tcW w:w="2376" w:type="dxa"/>
+            <w:tcW w:w="2258" w:type="dxa"/>
           </w:tcPr>
           <w:p>
             <w:pPr>
@@ -4431,7 +4431,7 @@
         </w:trPr>
         <w:tc>
           <w:tcPr>
-            <w:tcW w:w="362" w:type="dxa"/>
+            <w:tcW w:w="480" w:type="dxa"/>
             <w:vAlign w:val="center"/>
           </w:tcPr>
           <w:p>
@@ -4483,7 +4483,7 @@
         </w:tc>
         <w:tc>
           <w:tcPr>
-            <w:tcW w:w="2376" w:type="dxa"/>
+            <w:tcW w:w="2258" w:type="dxa"/>
           </w:tcPr>
           <w:p>
             <w:pPr>
@@ -4628,7 +4628,7 @@
         </w:trPr>
         <w:tc>
           <w:tcPr>
-            <w:tcW w:w="362" w:type="dxa"/>
+            <w:tcW w:w="480" w:type="dxa"/>
             <w:vAlign w:val="center"/>
           </w:tcPr>
           <w:p>
@@ -4671,7 +4671,7 @@
         </w:tc>
         <w:tc>
           <w:tcPr>
-            <w:tcW w:w="2376" w:type="dxa"/>
+            <w:tcW w:w="2258" w:type="dxa"/>
           </w:tcPr>
           <w:p>
             <w:pPr>
@@ -4786,7 +4786,7 @@
         </w:trPr>
         <w:tc>
           <w:tcPr>
-            <w:tcW w:w="362" w:type="dxa"/>
+            <w:tcW w:w="480" w:type="dxa"/>
             <w:vAlign w:val="center"/>
           </w:tcPr>
           <w:p>
@@ -4829,7 +4829,7 @@
         </w:tc>
         <w:tc>
           <w:tcPr>
-            <w:tcW w:w="2376" w:type="dxa"/>
+            <w:tcW w:w="2258" w:type="dxa"/>
           </w:tcPr>
           <w:p>
             <w:pPr>
@@ -4944,7 +4944,7 @@
         </w:trPr>
         <w:tc>
           <w:tcPr>
-            <w:tcW w:w="362" w:type="dxa"/>
+            <w:tcW w:w="480" w:type="dxa"/>
             <w:vAlign w:val="center"/>
           </w:tcPr>
           <w:p>
@@ -4987,7 +4987,7 @@
         </w:tc>
         <w:tc>
           <w:tcPr>
-            <w:tcW w:w="2376" w:type="dxa"/>
+            <w:tcW w:w="2258" w:type="dxa"/>
           </w:tcPr>
           <w:p>
             <w:pPr>

</xml_diff>